<commit_message>
fix: make login test cases universal by removing Non Employee from titles
</commit_message>
<xml_diff>
--- a/Hasil Uji/Dokumen_Hasil_Uji_Mobile.docx
+++ b/Hasil Uji/Dokumen_Hasil_Uji_Mobile.docx
@@ -4767,7 +4767,7 @@
                 <w:szCs w:val="20"/>
                 <w:rtl w:val="0"/>
               </w:rPr>
-              <w:t xml:space="preserve"> Membuka halaman Login Non Employee</w:t>
+              <w:t xml:space="preserve"> Membuka halaman Login</w:t>
             </w:r>
             <w:r>
               <w:rPr>
@@ -5247,7 +5247,7 @@
                 <w:szCs w:val="20"/>
                 <w:rtl w:val="0"/>
               </w:rPr>
-              <w:t xml:space="preserve"> Melakukan login Non Employee dengan email dan password valid</w:t>
+              <w:t xml:space="preserve"> Melakukan login dengan email dan password valid</w:t>
             </w:r>
             <w:r>
               <w:rPr>
@@ -5470,7 +5470,7 @@
                 <w:szCs w:val="20"/>
                 <w:rtl w:val="0"/>
               </w:rPr>
-              <w:t xml:space="preserve"> Melakukan login Non Employee dengan email tidak terdaftar</w:t>
+              <w:t xml:space="preserve"> Melakukan login dengan email tidak terdaftar</w:t>
             </w:r>
             <w:r>
               <w:rPr>
@@ -5693,7 +5693,7 @@
                 <w:szCs w:val="20"/>
                 <w:rtl w:val="0"/>
               </w:rPr>
-              <w:t xml:space="preserve"> Melakukan login Non Employee dengan password salah</w:t>
+              <w:t xml:space="preserve"> Melakukan login dengan password salah</w:t>
             </w:r>
             <w:r>
               <w:rPr>

</xml_diff>

<commit_message>
feat: insert demo screenshot for TC 1.1 into Dokumen_Hasil_Uji_Mobile.docx
</commit_message>
<xml_diff>
--- a/Hasil Uji/Dokumen_Hasil_Uji_Mobile.docx
+++ b/Hasil Uji/Dokumen_Hasil_Uji_Mobile.docx
@@ -4816,195 +4816,42 @@
           <w:tcPr/>
           <w:p>
             <w:pPr>
-              <w:spacing w:before="116" w:lineRule="auto"/>
+              <w:spacing w:before="120" w:after="120"/>
               <w:jc w:val="center"/>
-              <w:rPr/>
-            </w:pPr>
-            <w:r>
-              <w:rPr>
-                <w:rtl w:val="0"/>
-              </w:rPr>
-            </w:r>
-          </w:p>
-          <w:p>
-            <w:pPr>
-              <w:spacing w:before="116" w:lineRule="auto"/>
-              <w:jc w:val="center"/>
-              <w:rPr/>
-            </w:pPr>
-            <w:r>
-              <w:rPr>
-                <w:rtl w:val="0"/>
-              </w:rPr>
-            </w:r>
-          </w:p>
-          <w:p>
-            <w:pPr>
-              <w:spacing w:before="116" w:lineRule="auto"/>
-              <w:jc w:val="center"/>
-              <w:rPr/>
-            </w:pPr>
-            <w:r>
-              <w:rPr>
-                <w:rtl w:val="0"/>
-              </w:rPr>
-            </w:r>
-          </w:p>
-          <w:p>
-            <w:pPr>
-              <w:spacing w:before="116" w:lineRule="auto"/>
-              <w:jc w:val="center"/>
-              <w:rPr/>
-            </w:pPr>
-            <w:r>
-              <w:rPr>
-                <w:rtl w:val="0"/>
-              </w:rPr>
-            </w:r>
-          </w:p>
-          <w:p>
-            <w:pPr>
-              <w:spacing w:before="116" w:lineRule="auto"/>
-              <w:jc w:val="center"/>
-              <w:rPr/>
-            </w:pPr>
-            <w:r>
-              <w:rPr>
-                <w:rtl w:val="0"/>
-              </w:rPr>
-            </w:r>
-          </w:p>
-          <w:p>
-            <w:pPr>
-              <w:spacing w:before="116" w:lineRule="auto"/>
-              <w:jc w:val="center"/>
-              <w:rPr/>
-            </w:pPr>
-            <w:r>
-              <w:rPr>
-                <w:rtl w:val="0"/>
-              </w:rPr>
-            </w:r>
-          </w:p>
-          <w:p>
-            <w:pPr>
-              <w:spacing w:before="116" w:lineRule="auto"/>
-              <w:jc w:val="left"/>
-              <w:rPr/>
-            </w:pPr>
-            <w:r>
-              <w:rPr>
-                <w:rtl w:val="0"/>
-              </w:rPr>
-            </w:r>
-          </w:p>
-          <w:p>
-            <w:pPr>
-              <w:spacing w:before="116" w:lineRule="auto"/>
-              <w:jc w:val="left"/>
-              <w:rPr/>
-            </w:pPr>
-            <w:r>
-              <w:rPr>
-                <w:rtl w:val="0"/>
-              </w:rPr>
-            </w:r>
-          </w:p>
-          <w:p>
-            <w:pPr>
-              <w:spacing w:before="116" w:lineRule="auto"/>
-              <w:jc w:val="left"/>
-              <w:rPr/>
-            </w:pPr>
-            <w:r>
-              <w:rPr>
-                <w:rtl w:val="0"/>
-              </w:rPr>
-            </w:r>
-          </w:p>
-          <w:p>
-            <w:pPr>
-              <w:spacing w:before="116" w:lineRule="auto"/>
-              <w:jc w:val="left"/>
-              <w:rPr/>
-            </w:pPr>
-            <w:r>
-              <w:rPr>
-                <w:rtl w:val="0"/>
-              </w:rPr>
-            </w:r>
-          </w:p>
-          <w:p>
-            <w:pPr>
-              <w:spacing w:before="116" w:lineRule="auto"/>
-              <w:jc w:val="left"/>
-              <w:rPr/>
-            </w:pPr>
-            <w:r>
-              <w:rPr>
-                <w:rtl w:val="0"/>
-              </w:rPr>
-            </w:r>
-          </w:p>
-          <w:p>
-            <w:pPr>
-              <w:spacing w:before="116" w:lineRule="auto"/>
-              <w:jc w:val="left"/>
-              <w:rPr/>
-            </w:pPr>
-            <w:r>
-              <w:rPr>
-                <w:rtl w:val="0"/>
-              </w:rPr>
-            </w:r>
-          </w:p>
-          <w:p>
-            <w:pPr>
-              <w:spacing w:before="116" w:lineRule="auto"/>
-              <w:jc w:val="left"/>
-              <w:rPr/>
-            </w:pPr>
-            <w:r>
-              <w:rPr>
-                <w:rtl w:val="0"/>
-              </w:rPr>
-            </w:r>
-          </w:p>
-          <w:p>
-            <w:pPr>
-              <w:spacing w:before="116" w:lineRule="auto"/>
-              <w:jc w:val="left"/>
-              <w:rPr/>
-            </w:pPr>
-            <w:r>
-              <w:rPr>
-                <w:rtl w:val="0"/>
-              </w:rPr>
-            </w:r>
-          </w:p>
-          <w:p>
-            <w:pPr>
-              <w:spacing w:before="116" w:lineRule="auto"/>
-              <w:jc w:val="center"/>
-              <w:rPr/>
-            </w:pPr>
-            <w:r>
-              <w:rPr>
-                <w:rtl w:val="0"/>
-              </w:rPr>
-            </w:r>
-          </w:p>
-          <w:p>
-            <w:pPr>
-              <w:spacing w:before="116" w:lineRule="auto"/>
-              <w:jc w:val="center"/>
-              <w:rPr/>
-            </w:pPr>
-            <w:r>
-              <w:rPr>
-                <w:rtl w:val="0"/>
-              </w:rPr>
-              <w:t xml:space="preserve">-</w:t>
+            </w:pPr>
+            <w:r>
+              <w:drawing>
+                <wp:inline>
+                  <wp:extent cx="1851931" cy="3840480"/>
+                  <wp:docPr id="303" name="Picture 303"/>
+                  <wp:cNvGraphicFramePr>
+                    <a:graphicFrameLocks noChangeAspect="1"/>
+                  </wp:cNvGraphicFramePr>
+                  <a:graphic>
+                    <a:graphicData uri="http://schemas.openxmlformats.org/drawingml/2006/picture">
+                      <pic:pic>
+                        <pic:nvPicPr>
+                          <pic:cNvPr id="0" name="2.jpg"/>
+                          <pic:cNvPicPr/>
+                        </pic:nvPicPr>
+                        <pic:blipFill>
+                          <a:blip r:embed="rId15"/>
+                          <a:stretch>
+                            <a:fillRect/>
+                          </a:stretch>
+                        </pic:blipFill>
+                        <pic:spPr>
+                          <a:xfrm>
+                            <a:off x="0" y="0"/>
+                            <a:ext cx="1851931" cy="3840480"/>
+                          </a:xfrm>
+                          <a:prstGeom prst="rect"/>
+                        </pic:spPr>
+                      </pic:pic>
+                    </a:graphicData>
+                  </a:graphic>
+                </wp:inline>
+              </w:drawing>
             </w:r>
           </w:p>
         </w:tc>
@@ -5077,6 +4924,12 @@
               <w:rPr>
                 <w:rtl w:val="0"/>
               </w:rPr>
+            </w:r>
+            <w:r>
+              <w:rPr>
+                <w:color w:val="2C5293"/>
+              </w:rPr>
+              <w:t xml:space="preserve"> - [Success]</w:t>
             </w:r>
           </w:p>
         </w:tc>

</xml_diff>

<commit_message>
feat(mobile): sync screenshots 1.1-1.4, 2.1-2.3, 3.1-3.2, clean SIT expected format, and update test scripts
</commit_message>
<xml_diff>
--- a/Hasil Uji/Dokumen_Hasil_Uji_Mobile.docx
+++ b/Hasil Uji/Dokumen_Hasil_Uji_Mobile.docx
@@ -4822,8 +4822,8 @@
             <w:r>
               <w:drawing>
                 <wp:inline>
-                  <wp:extent cx="1851931" cy="3840480"/>
-                  <wp:docPr id="303" name="Picture 303"/>
+                  <wp:extent cx="1763744" cy="3657600"/>
+                  <wp:docPr id="309" name="Picture 309"/>
                   <wp:cNvGraphicFramePr>
                     <a:graphicFrameLocks noChangeAspect="1"/>
                   </wp:cNvGraphicFramePr>
@@ -4831,11 +4831,11 @@
                     <a:graphicData uri="http://schemas.openxmlformats.org/drawingml/2006/picture">
                       <pic:pic>
                         <pic:nvPicPr>
-                          <pic:cNvPr id="0" name="2.jpg"/>
+                          <pic:cNvPr id="0" name="image.jpg"/>
                           <pic:cNvPicPr/>
                         </pic:nvPicPr>
                         <pic:blipFill>
-                          <a:blip r:embed="rId15"/>
+                          <a:blip r:embed="rId16"/>
                           <a:stretch>
                             <a:fillRect/>
                           </a:stretch>
@@ -4843,7 +4843,40 @@
                         <pic:spPr>
                           <a:xfrm>
                             <a:off x="0" y="0"/>
-                            <a:ext cx="1851931" cy="3840480"/>
+                            <a:ext cx="1763744" cy="3657600"/>
+                          </a:xfrm>
+                          <a:prstGeom prst="rect"/>
+                        </pic:spPr>
+                      </pic:pic>
+                    </a:graphicData>
+                  </a:graphic>
+                </wp:inline>
+              </w:drawing>
+              <w:t xml:space="preserve">   </w:t>
+              <w:drawing>
+                <wp:inline>
+                  <wp:extent cx="1763744" cy="3657600"/>
+                  <wp:docPr id="310" name="Picture 310"/>
+                  <wp:cNvGraphicFramePr>
+                    <a:graphicFrameLocks noChangeAspect="1"/>
+                  </wp:cNvGraphicFramePr>
+                  <a:graphic>
+                    <a:graphicData uri="http://schemas.openxmlformats.org/drawingml/2006/picture">
+                      <pic:pic>
+                        <pic:nvPicPr>
+                          <pic:cNvPr id="0" name="image.jpg"/>
+                          <pic:cNvPicPr/>
+                        </pic:nvPicPr>
+                        <pic:blipFill>
+                          <a:blip r:embed="rId17"/>
+                          <a:stretch>
+                            <a:fillRect/>
+                          </a:stretch>
+                        </pic:blipFill>
+                        <pic:spPr>
+                          <a:xfrm>
+                            <a:off x="0" y="0"/>
+                            <a:ext cx="1763744" cy="3657600"/>
                           </a:xfrm>
                           <a:prstGeom prst="rect"/>
                         </pic:spPr>
@@ -4896,38 +4929,30 @@
           <w:tcPr/>
           <w:p>
             <w:pPr>
-              <w:spacing w:before="116" w:lineRule="auto"/>
-              <w:rPr/>
-            </w:pPr>
-            <w:r>
-              <w:rPr>
-                <w:rFonts w:ascii="Arial" w:cs="Arial" w:eastAsia="Arial" w:hAnsi="Arial"/>
-                <w:b w:val="1"/>
-                <w:bCs w:val="1"/>
-                <w:sz w:val="20"/>
-                <w:szCs w:val="20"/>
-                <w:rtl w:val="0"/>
-              </w:rPr>
-              <w:t xml:space="preserve">Hasil yang diharapkan [STATUS]:</w:t>
-              <w:br w:type="textWrapping"/>
-            </w:r>
-            <w:r>
-              <w:rPr>
-                <w:rFonts w:ascii="Arial" w:cs="Arial" w:eastAsia="Arial" w:hAnsi="Arial"/>
-                <w:sz w:val="20"/>
-                <w:szCs w:val="20"/>
-                <w:rtl w:val="0"/>
-              </w:rPr>
-              <w:t xml:space="preserve">Berhasil membuka aplikasi dan menampilkan halaman login.</w:t>
-            </w:r>
-            <w:r>
-              <w:rPr>
-                <w:rtl w:val="0"/>
-              </w:rPr>
-            </w:r>
-            <w:r>
-              <w:rPr>
+              <w:spacing w:before="116"/>
+            </w:pPr>
+            <w:r>
+              <w:rPr>
+                <w:rFonts w:ascii="Arial" w:hAnsi="Arial"/>
+                <w:b/>
+                <w:sz w:val="20"/>
+              </w:rPr>
+              <w:t>Hasil yang diharapkan [STATUS]:</w:t>
+              <w:br/>
+            </w:r>
+            <w:r>
+              <w:rPr>
+                <w:rFonts w:ascii="Arial" w:hAnsi="Arial"/>
+                <w:sz w:val="20"/>
+              </w:rPr>
+              <w:t>Berhasil membuka aplikasi dan menampilkan halaman login.</w:t>
+            </w:r>
+            <w:r>
+              <w:rPr>
+                <w:rFonts w:ascii="Arial" w:hAnsi="Arial"/>
+                <w:b/>
                 <w:color w:val="2C5293"/>
+                <w:sz w:val="20"/>
               </w:rPr>
               <w:t xml:space="preserve"> - [Success]</w:t>
             </w:r>
@@ -5149,14 +5174,75 @@
           <w:tcPr/>
           <w:p>
             <w:pPr>
-              <w:spacing w:before="116" w:lineRule="auto"/>
+              <w:spacing w:before="120" w:after="120"/>
               <w:jc w:val="center"/>
-              <w:rPr/>
-            </w:pPr>
-            <w:r>
-              <w:rPr>
-                <w:rtl w:val="0"/>
-              </w:rPr>
+            </w:pPr>
+            <w:r>
+              <w:drawing>
+                <wp:inline>
+                  <wp:extent cx="1763744" cy="3657600"/>
+                  <wp:docPr id="311" name="Picture 311"/>
+                  <wp:cNvGraphicFramePr>
+                    <a:graphicFrameLocks noChangeAspect="1"/>
+                  </wp:cNvGraphicFramePr>
+                  <a:graphic>
+                    <a:graphicData uri="http://schemas.openxmlformats.org/drawingml/2006/picture">
+                      <pic:pic>
+                        <pic:nvPicPr>
+                          <pic:cNvPr id="0" name="image.jpg"/>
+                          <pic:cNvPicPr/>
+                        </pic:nvPicPr>
+                        <pic:blipFill>
+                          <a:blip r:embed="rId20"/>
+                          <a:stretch>
+                            <a:fillRect/>
+                          </a:stretch>
+                        </pic:blipFill>
+                        <pic:spPr>
+                          <a:xfrm>
+                            <a:off x="0" y="0"/>
+                            <a:ext cx="1763744" cy="3657600"/>
+                          </a:xfrm>
+                          <a:prstGeom prst="rect"/>
+                        </pic:spPr>
+                      </pic:pic>
+                    </a:graphicData>
+                  </a:graphic>
+                </wp:inline>
+              </w:drawing>
+              <w:t xml:space="preserve">   </w:t>
+              <w:drawing>
+                <wp:inline>
+                  <wp:extent cx="1763744" cy="3657600"/>
+                  <wp:docPr id="312" name="Picture 312"/>
+                  <wp:cNvGraphicFramePr>
+                    <a:graphicFrameLocks noChangeAspect="1"/>
+                  </wp:cNvGraphicFramePr>
+                  <a:graphic>
+                    <a:graphicData uri="http://schemas.openxmlformats.org/drawingml/2006/picture">
+                      <pic:pic>
+                        <pic:nvPicPr>
+                          <pic:cNvPr id="0" name="image.jpg"/>
+                          <pic:cNvPicPr/>
+                        </pic:nvPicPr>
+                        <pic:blipFill>
+                          <a:blip r:embed="rId19"/>
+                          <a:stretch>
+                            <a:fillRect/>
+                          </a:stretch>
+                        </pic:blipFill>
+                        <pic:spPr>
+                          <a:xfrm>
+                            <a:off x="0" y="0"/>
+                            <a:ext cx="1763744" cy="3657600"/>
+                          </a:xfrm>
+                          <a:prstGeom prst="rect"/>
+                        </pic:spPr>
+                      </pic:pic>
+                    </a:graphicData>
+                  </a:graphic>
+                </wp:inline>
+              </w:drawing>
             </w:r>
           </w:p>
         </w:tc>
@@ -5205,34 +5291,32 @@
           </w:tcPr>
           <w:p>
             <w:pPr>
-              <w:spacing w:before="116" w:lineRule="auto"/>
-              <w:rPr/>
-            </w:pPr>
-            <w:r>
-              <w:rPr>
-                <w:rFonts w:ascii="Arial" w:cs="Arial" w:eastAsia="Arial" w:hAnsi="Arial"/>
-                <w:b w:val="1"/>
-                <w:bCs w:val="1"/>
-                <w:sz w:val="20"/>
-                <w:szCs w:val="20"/>
-                <w:rtl w:val="0"/>
-              </w:rPr>
-              <w:t xml:space="preserve">Hasil yang diharapkan [STATUS]:</w:t>
-              <w:br w:type="textWrapping"/>
-            </w:r>
-            <w:r>
-              <w:rPr>
-                <w:rFonts w:ascii="Arial" w:cs="Arial" w:eastAsia="Arial" w:hAnsi="Arial"/>
-                <w:sz w:val="20"/>
-                <w:szCs w:val="20"/>
-                <w:rtl w:val="0"/>
-              </w:rPr>
-              <w:t xml:space="preserve">Berhasil melakukan login dan diarahkan ke halaman 2 Factor Authentication.</w:t>
-            </w:r>
-            <w:r>
-              <w:rPr>
-                <w:rtl w:val="0"/>
-              </w:rPr>
+              <w:spacing w:before="116"/>
+            </w:pPr>
+            <w:r>
+              <w:rPr>
+                <w:rFonts w:ascii="Arial" w:hAnsi="Arial"/>
+                <w:b/>
+                <w:sz w:val="20"/>
+              </w:rPr>
+              <w:t>Hasil yang diharapkan [STATUS]:</w:t>
+              <w:br/>
+            </w:r>
+            <w:r>
+              <w:rPr>
+                <w:rFonts w:ascii="Arial" w:hAnsi="Arial"/>
+                <w:sz w:val="20"/>
+              </w:rPr>
+              <w:t>Berhasil melakukan login dan diarahkan ke halaman 2 Factor Authentication.</w:t>
+            </w:r>
+            <w:r>
+              <w:rPr>
+                <w:rFonts w:ascii="Arial" w:hAnsi="Arial"/>
+                <w:b/>
+                <w:color w:val="2C5293"/>
+                <w:sz w:val="20"/>
+              </w:rPr>
+              <w:t xml:space="preserve"> - [Success]</w:t>
             </w:r>
           </w:p>
         </w:tc>
@@ -5372,14 +5456,75 @@
           <w:tcPr/>
           <w:p>
             <w:pPr>
-              <w:spacing w:before="116" w:lineRule="auto"/>
+              <w:spacing w:before="120" w:after="120"/>
               <w:jc w:val="center"/>
-              <w:rPr/>
-            </w:pPr>
-            <w:r>
-              <w:rPr>
-                <w:rtl w:val="0"/>
-              </w:rPr>
+            </w:pPr>
+            <w:r>
+              <w:drawing>
+                <wp:inline>
+                  <wp:extent cx="1763744" cy="3657600"/>
+                  <wp:docPr id="313" name="Picture 313"/>
+                  <wp:cNvGraphicFramePr>
+                    <a:graphicFrameLocks noChangeAspect="1"/>
+                  </wp:cNvGraphicFramePr>
+                  <a:graphic>
+                    <a:graphicData uri="http://schemas.openxmlformats.org/drawingml/2006/picture">
+                      <pic:pic>
+                        <pic:nvPicPr>
+                          <pic:cNvPr id="0" name="1.jpg"/>
+                          <pic:cNvPicPr/>
+                        </pic:nvPicPr>
+                        <pic:blipFill>
+                          <a:blip r:embed="rId23"/>
+                          <a:stretch>
+                            <a:fillRect/>
+                          </a:stretch>
+                        </pic:blipFill>
+                        <pic:spPr>
+                          <a:xfrm>
+                            <a:off x="0" y="0"/>
+                            <a:ext cx="1763744" cy="3657600"/>
+                          </a:xfrm>
+                          <a:prstGeom prst="rect"/>
+                        </pic:spPr>
+                      </pic:pic>
+                    </a:graphicData>
+                  </a:graphic>
+                </wp:inline>
+              </w:drawing>
+              <w:t xml:space="preserve">   </w:t>
+              <w:drawing>
+                <wp:inline>
+                  <wp:extent cx="1763744" cy="3657600"/>
+                  <wp:docPr id="314" name="Picture 314"/>
+                  <wp:cNvGraphicFramePr>
+                    <a:graphicFrameLocks noChangeAspect="1"/>
+                  </wp:cNvGraphicFramePr>
+                  <a:graphic>
+                    <a:graphicData uri="http://schemas.openxmlformats.org/drawingml/2006/picture">
+                      <pic:pic>
+                        <pic:nvPicPr>
+                          <pic:cNvPr id="0" name="image.jpg"/>
+                          <pic:cNvPicPr/>
+                        </pic:nvPicPr>
+                        <pic:blipFill>
+                          <a:blip r:embed="rId22"/>
+                          <a:stretch>
+                            <a:fillRect/>
+                          </a:stretch>
+                        </pic:blipFill>
+                        <pic:spPr>
+                          <a:xfrm>
+                            <a:off x="0" y="0"/>
+                            <a:ext cx="1763744" cy="3657600"/>
+                          </a:xfrm>
+                          <a:prstGeom prst="rect"/>
+                        </pic:spPr>
+                      </pic:pic>
+                    </a:graphicData>
+                  </a:graphic>
+                </wp:inline>
+              </w:drawing>
             </w:r>
           </w:p>
         </w:tc>
@@ -5428,34 +5573,32 @@
           </w:tcPr>
           <w:p>
             <w:pPr>
-              <w:spacing w:before="116" w:lineRule="auto"/>
-              <w:rPr/>
-            </w:pPr>
-            <w:r>
-              <w:rPr>
-                <w:rFonts w:ascii="Arial" w:cs="Arial" w:eastAsia="Arial" w:hAnsi="Arial"/>
-                <w:b w:val="1"/>
-                <w:bCs w:val="1"/>
-                <w:sz w:val="20"/>
-                <w:szCs w:val="20"/>
-                <w:rtl w:val="0"/>
-              </w:rPr>
-              <w:t xml:space="preserve">Hasil yang diharapkan [STATUS]:</w:t>
-              <w:br w:type="textWrapping"/>
-            </w:r>
-            <w:r>
-              <w:rPr>
-                <w:rFonts w:ascii="Arial" w:cs="Arial" w:eastAsia="Arial" w:hAnsi="Arial"/>
-                <w:sz w:val="20"/>
-                <w:szCs w:val="20"/>
-                <w:rtl w:val="0"/>
-              </w:rPr>
-              <w:t xml:space="preserve">Menampilkan pesan error email tidak terdaftar.</w:t>
-            </w:r>
-            <w:r>
-              <w:rPr>
-                <w:rtl w:val="0"/>
-              </w:rPr>
+              <w:spacing w:before="116"/>
+            </w:pPr>
+            <w:r>
+              <w:rPr>
+                <w:rFonts w:ascii="Arial" w:hAnsi="Arial"/>
+                <w:b/>
+                <w:sz w:val="20"/>
+              </w:rPr>
+              <w:t>Hasil yang diharapkan [STATUS]:</w:t>
+              <w:br/>
+            </w:r>
+            <w:r>
+              <w:rPr>
+                <w:rFonts w:ascii="Arial" w:hAnsi="Arial"/>
+                <w:sz w:val="20"/>
+              </w:rPr>
+              <w:t>Menampilkan pesan error email tidak terdaftar.</w:t>
+            </w:r>
+            <w:r>
+              <w:rPr>
+                <w:rFonts w:ascii="Arial" w:hAnsi="Arial"/>
+                <w:b/>
+                <w:color w:val="2C5293"/>
+                <w:sz w:val="20"/>
+              </w:rPr>
+              <w:t xml:space="preserve"> - [Success]</w:t>
             </w:r>
           </w:p>
         </w:tc>
@@ -5595,14 +5738,75 @@
           <w:tcPr/>
           <w:p>
             <w:pPr>
-              <w:spacing w:before="116" w:lineRule="auto"/>
+              <w:spacing w:before="120" w:after="120"/>
               <w:jc w:val="center"/>
-              <w:rPr/>
-            </w:pPr>
-            <w:r>
-              <w:rPr>
-                <w:rtl w:val="0"/>
-              </w:rPr>
+            </w:pPr>
+            <w:r>
+              <w:drawing>
+                <wp:inline>
+                  <wp:extent cx="1763744" cy="3657600"/>
+                  <wp:docPr id="315" name="Picture 315"/>
+                  <wp:cNvGraphicFramePr>
+                    <a:graphicFrameLocks noChangeAspect="1"/>
+                  </wp:cNvGraphicFramePr>
+                  <a:graphic>
+                    <a:graphicData uri="http://schemas.openxmlformats.org/drawingml/2006/picture">
+                      <pic:pic>
+                        <pic:nvPicPr>
+                          <pic:cNvPr id="0" name="1.jpg"/>
+                          <pic:cNvPicPr/>
+                        </pic:nvPicPr>
+                        <pic:blipFill>
+                          <a:blip r:embed="rId24"/>
+                          <a:stretch>
+                            <a:fillRect/>
+                          </a:stretch>
+                        </pic:blipFill>
+                        <pic:spPr>
+                          <a:xfrm>
+                            <a:off x="0" y="0"/>
+                            <a:ext cx="1763744" cy="3657600"/>
+                          </a:xfrm>
+                          <a:prstGeom prst="rect"/>
+                        </pic:spPr>
+                      </pic:pic>
+                    </a:graphicData>
+                  </a:graphic>
+                </wp:inline>
+              </w:drawing>
+              <w:t xml:space="preserve">   </w:t>
+              <w:drawing>
+                <wp:inline>
+                  <wp:extent cx="1763744" cy="3657600"/>
+                  <wp:docPr id="316" name="Picture 316"/>
+                  <wp:cNvGraphicFramePr>
+                    <a:graphicFrameLocks noChangeAspect="1"/>
+                  </wp:cNvGraphicFramePr>
+                  <a:graphic>
+                    <a:graphicData uri="http://schemas.openxmlformats.org/drawingml/2006/picture">
+                      <pic:pic>
+                        <pic:nvPicPr>
+                          <pic:cNvPr id="0" name="image.jpg"/>
+                          <pic:cNvPicPr/>
+                        </pic:nvPicPr>
+                        <pic:blipFill>
+                          <a:blip r:embed="rId22"/>
+                          <a:stretch>
+                            <a:fillRect/>
+                          </a:stretch>
+                        </pic:blipFill>
+                        <pic:spPr>
+                          <a:xfrm>
+                            <a:off x="0" y="0"/>
+                            <a:ext cx="1763744" cy="3657600"/>
+                          </a:xfrm>
+                          <a:prstGeom prst="rect"/>
+                        </pic:spPr>
+                      </pic:pic>
+                    </a:graphicData>
+                  </a:graphic>
+                </wp:inline>
+              </w:drawing>
             </w:r>
           </w:p>
         </w:tc>
@@ -5651,34 +5855,32 @@
           </w:tcPr>
           <w:p>
             <w:pPr>
-              <w:spacing w:before="116" w:lineRule="auto"/>
-              <w:rPr/>
-            </w:pPr>
-            <w:r>
-              <w:rPr>
-                <w:rFonts w:ascii="Arial" w:cs="Arial" w:eastAsia="Arial" w:hAnsi="Arial"/>
-                <w:b w:val="1"/>
-                <w:bCs w:val="1"/>
-                <w:sz w:val="20"/>
-                <w:szCs w:val="20"/>
-                <w:rtl w:val="0"/>
-              </w:rPr>
-              <w:t xml:space="preserve">Hasil yang diharapkan [STATUS]:</w:t>
-              <w:br w:type="textWrapping"/>
-            </w:r>
-            <w:r>
-              <w:rPr>
-                <w:rFonts w:ascii="Arial" w:cs="Arial" w:eastAsia="Arial" w:hAnsi="Arial"/>
-                <w:sz w:val="20"/>
-                <w:szCs w:val="20"/>
-                <w:rtl w:val="0"/>
-              </w:rPr>
-              <w:t xml:space="preserve">Menampilkan pesan error autentikasi.</w:t>
-            </w:r>
-            <w:r>
-              <w:rPr>
-                <w:rtl w:val="0"/>
-              </w:rPr>
+              <w:spacing w:before="116"/>
+            </w:pPr>
+            <w:r>
+              <w:rPr>
+                <w:rFonts w:ascii="Arial" w:hAnsi="Arial"/>
+                <w:b/>
+                <w:sz w:val="20"/>
+              </w:rPr>
+              <w:t>Hasil yang diharapkan [STATUS]:</w:t>
+              <w:br/>
+            </w:r>
+            <w:r>
+              <w:rPr>
+                <w:rFonts w:ascii="Arial" w:hAnsi="Arial"/>
+                <w:sz w:val="20"/>
+              </w:rPr>
+              <w:t>Menampilkan pesan error autentikasi.</w:t>
+            </w:r>
+            <w:r>
+              <w:rPr>
+                <w:rFonts w:ascii="Arial" w:hAnsi="Arial"/>
+                <w:b/>
+                <w:color w:val="2C5293"/>
+                <w:sz w:val="20"/>
+              </w:rPr>
+              <w:t xml:space="preserve"> - [Success]</w:t>
             </w:r>
           </w:p>
         </w:tc>
@@ -5874,34 +6076,23 @@
           </w:tcPr>
           <w:p>
             <w:pPr>
-              <w:spacing w:before="116" w:lineRule="auto"/>
-              <w:rPr/>
-            </w:pPr>
-            <w:r>
-              <w:rPr>
-                <w:rFonts w:ascii="Arial" w:cs="Arial" w:eastAsia="Arial" w:hAnsi="Arial"/>
-                <w:b w:val="1"/>
-                <w:bCs w:val="1"/>
-                <w:sz w:val="20"/>
-                <w:szCs w:val="20"/>
-                <w:rtl w:val="0"/>
-              </w:rPr>
-              <w:t xml:space="preserve">Hasil yang diharapkan [STATUS]:</w:t>
-              <w:br w:type="textWrapping"/>
-            </w:r>
-            <w:r>
-              <w:rPr>
-                <w:rFonts w:ascii="Arial" w:cs="Arial" w:eastAsia="Arial" w:hAnsi="Arial"/>
-                <w:sz w:val="20"/>
-                <w:szCs w:val="20"/>
-                <w:rtl w:val="0"/>
-              </w:rPr>
-              <w:t xml:space="preserve">Menampilkan pesan error field mandatory.</w:t>
-            </w:r>
-            <w:r>
-              <w:rPr>
-                <w:rtl w:val="0"/>
-              </w:rPr>
+              <w:spacing w:before="116"/>
+            </w:pPr>
+            <w:r>
+              <w:rPr>
+                <w:rFonts w:ascii="Arial" w:hAnsi="Arial"/>
+                <w:b/>
+                <w:sz w:val="20"/>
+              </w:rPr>
+              <w:t>Hasil yang diharapkan [STATUS]:</w:t>
+              <w:br/>
+            </w:r>
+            <w:r>
+              <w:rPr>
+                <w:rFonts w:ascii="Arial" w:hAnsi="Arial"/>
+                <w:sz w:val="20"/>
+              </w:rPr>
+              <w:t>Menampilkan pesan error field mandatory.</w:t>
             </w:r>
           </w:p>
         </w:tc>
@@ -6097,34 +6288,23 @@
           </w:tcPr>
           <w:p>
             <w:pPr>
-              <w:spacing w:before="116" w:lineRule="auto"/>
-              <w:rPr/>
-            </w:pPr>
-            <w:r>
-              <w:rPr>
-                <w:rFonts w:ascii="Arial" w:cs="Arial" w:eastAsia="Arial" w:hAnsi="Arial"/>
-                <w:b w:val="1"/>
-                <w:bCs w:val="1"/>
-                <w:sz w:val="20"/>
-                <w:szCs w:val="20"/>
-                <w:rtl w:val="0"/>
-              </w:rPr>
-              <w:t xml:space="preserve">Hasil yang diharapkan [STATUS]:</w:t>
-              <w:br w:type="textWrapping"/>
-            </w:r>
-            <w:r>
-              <w:rPr>
-                <w:rFonts w:ascii="Arial" w:cs="Arial" w:eastAsia="Arial" w:hAnsi="Arial"/>
-                <w:sz w:val="20"/>
-                <w:szCs w:val="20"/>
-                <w:rtl w:val="0"/>
-              </w:rPr>
-              <w:t xml:space="preserve">Menampilkan pesan error field mandatory.</w:t>
-            </w:r>
-            <w:r>
-              <w:rPr>
-                <w:rtl w:val="0"/>
-              </w:rPr>
+              <w:spacing w:before="116"/>
+            </w:pPr>
+            <w:r>
+              <w:rPr>
+                <w:rFonts w:ascii="Arial" w:hAnsi="Arial"/>
+                <w:b/>
+                <w:sz w:val="20"/>
+              </w:rPr>
+              <w:t>Hasil yang diharapkan [STATUS]:</w:t>
+              <w:br/>
+            </w:r>
+            <w:r>
+              <w:rPr>
+                <w:rFonts w:ascii="Arial" w:hAnsi="Arial"/>
+                <w:sz w:val="20"/>
+              </w:rPr>
+              <w:t>Menampilkan pesan error field mandatory.</w:t>
             </w:r>
           </w:p>
         </w:tc>
@@ -6320,34 +6500,23 @@
           </w:tcPr>
           <w:p>
             <w:pPr>
-              <w:spacing w:before="116" w:lineRule="auto"/>
-              <w:rPr/>
-            </w:pPr>
-            <w:r>
-              <w:rPr>
-                <w:rFonts w:ascii="Arial" w:cs="Arial" w:eastAsia="Arial" w:hAnsi="Arial"/>
-                <w:b w:val="1"/>
-                <w:bCs w:val="1"/>
-                <w:sz w:val="20"/>
-                <w:szCs w:val="20"/>
-                <w:rtl w:val="0"/>
-              </w:rPr>
-              <w:t xml:space="preserve">Hasil yang diharapkan [STATUS]:</w:t>
-              <w:br w:type="textWrapping"/>
-            </w:r>
-            <w:r>
-              <w:rPr>
-                <w:rFonts w:ascii="Arial" w:cs="Arial" w:eastAsia="Arial" w:hAnsi="Arial"/>
-                <w:sz w:val="20"/>
-                <w:szCs w:val="20"/>
-                <w:rtl w:val="0"/>
-              </w:rPr>
-              <w:t xml:space="preserve">Menampilkan pesan error field mandatory.</w:t>
-            </w:r>
-            <w:r>
-              <w:rPr>
-                <w:rtl w:val="0"/>
-              </w:rPr>
+              <w:spacing w:before="116"/>
+            </w:pPr>
+            <w:r>
+              <w:rPr>
+                <w:rFonts w:ascii="Arial" w:hAnsi="Arial"/>
+                <w:b/>
+                <w:sz w:val="20"/>
+              </w:rPr>
+              <w:t>Hasil yang diharapkan [STATUS]:</w:t>
+              <w:br/>
+            </w:r>
+            <w:r>
+              <w:rPr>
+                <w:rFonts w:ascii="Arial" w:hAnsi="Arial"/>
+                <w:sz w:val="20"/>
+              </w:rPr>
+              <w:t>Menampilkan pesan error field mandatory.</w:t>
             </w:r>
           </w:p>
         </w:tc>
@@ -8395,14 +8564,75 @@
           <w:tcPr/>
           <w:p>
             <w:pPr>
-              <w:spacing w:before="116" w:lineRule="auto"/>
+              <w:spacing w:before="120" w:after="120"/>
               <w:jc w:val="center"/>
-              <w:rPr/>
-            </w:pPr>
-            <w:r>
-              <w:rPr>
-                <w:rtl w:val="0"/>
-              </w:rPr>
+            </w:pPr>
+            <w:r>
+              <w:drawing>
+                <wp:inline>
+                  <wp:extent cx="1722595" cy="3474720"/>
+                  <wp:docPr id="317" name="Picture 317"/>
+                  <wp:cNvGraphicFramePr>
+                    <a:graphicFrameLocks noChangeAspect="1"/>
+                  </wp:cNvGraphicFramePr>
+                  <a:graphic>
+                    <a:graphicData uri="http://schemas.openxmlformats.org/drawingml/2006/picture">
+                      <pic:pic>
+                        <pic:nvPicPr>
+                          <pic:cNvPr id="0" name="1.jpeg"/>
+                          <pic:cNvPicPr/>
+                        </pic:nvPicPr>
+                        <pic:blipFill>
+                          <a:blip r:embed="rId25"/>
+                          <a:stretch>
+                            <a:fillRect/>
+                          </a:stretch>
+                        </pic:blipFill>
+                        <pic:spPr>
+                          <a:xfrm>
+                            <a:off x="0" y="0"/>
+                            <a:ext cx="1722595" cy="3474720"/>
+                          </a:xfrm>
+                          <a:prstGeom prst="rect"/>
+                        </pic:spPr>
+                      </pic:pic>
+                    </a:graphicData>
+                  </a:graphic>
+                </wp:inline>
+              </w:drawing>
+              <w:t xml:space="preserve">   </w:t>
+              <w:drawing>
+                <wp:inline>
+                  <wp:extent cx="1707499" cy="3474720"/>
+                  <wp:docPr id="318" name="Picture 318"/>
+                  <wp:cNvGraphicFramePr>
+                    <a:graphicFrameLocks noChangeAspect="1"/>
+                  </wp:cNvGraphicFramePr>
+                  <a:graphic>
+                    <a:graphicData uri="http://schemas.openxmlformats.org/drawingml/2006/picture">
+                      <pic:pic>
+                        <pic:nvPicPr>
+                          <pic:cNvPr id="0" name="2.jpeg"/>
+                          <pic:cNvPicPr/>
+                        </pic:nvPicPr>
+                        <pic:blipFill>
+                          <a:blip r:embed="rId26"/>
+                          <a:stretch>
+                            <a:fillRect/>
+                          </a:stretch>
+                        </pic:blipFill>
+                        <pic:spPr>
+                          <a:xfrm>
+                            <a:off x="0" y="0"/>
+                            <a:ext cx="1707499" cy="3474720"/>
+                          </a:xfrm>
+                          <a:prstGeom prst="rect"/>
+                        </pic:spPr>
+                      </pic:pic>
+                    </a:graphicData>
+                  </a:graphic>
+                </wp:inline>
+              </w:drawing>
             </w:r>
           </w:p>
         </w:tc>
@@ -8475,6 +8705,15 @@
               <w:rPr>
                 <w:rtl w:val="0"/>
               </w:rPr>
+            </w:r>
+            <w:r>
+              <w:rPr>
+                <w:rFonts w:ascii="Arial" w:hAnsi="Arial"/>
+                <w:b/>
+                <w:color w:val="2C5293"/>
+                <w:sz w:val="20"/>
+              </w:rPr>
+              <w:t xml:space="preserve"> - [Success]</w:t>
             </w:r>
           </w:p>
         </w:tc>
@@ -8614,14 +8853,108 @@
           <w:tcPr/>
           <w:p>
             <w:pPr>
-              <w:spacing w:before="116" w:lineRule="auto"/>
+              <w:spacing w:before="120" w:after="120"/>
               <w:jc w:val="center"/>
-              <w:rPr/>
-            </w:pPr>
-            <w:r>
-              <w:rPr>
-                <w:rtl w:val="0"/>
-              </w:rPr>
+            </w:pPr>
+            <w:r>
+              <w:drawing>
+                <wp:inline>
+                  <wp:extent cx="1450606" cy="2926080"/>
+                  <wp:docPr id="319" name="Picture 319"/>
+                  <wp:cNvGraphicFramePr>
+                    <a:graphicFrameLocks noChangeAspect="1"/>
+                  </wp:cNvGraphicFramePr>
+                  <a:graphic>
+                    <a:graphicData uri="http://schemas.openxmlformats.org/drawingml/2006/picture">
+                      <pic:pic>
+                        <pic:nvPicPr>
+                          <pic:cNvPr id="0" name="1.jpeg"/>
+                          <pic:cNvPicPr/>
+                        </pic:nvPicPr>
+                        <pic:blipFill>
+                          <a:blip r:embed="rId25"/>
+                          <a:stretch>
+                            <a:fillRect/>
+                          </a:stretch>
+                        </pic:blipFill>
+                        <pic:spPr>
+                          <a:xfrm>
+                            <a:off x="0" y="0"/>
+                            <a:ext cx="1450606" cy="2926080"/>
+                          </a:xfrm>
+                          <a:prstGeom prst="rect"/>
+                        </pic:spPr>
+                      </pic:pic>
+                    </a:graphicData>
+                  </a:graphic>
+                </wp:inline>
+              </w:drawing>
+              <w:t xml:space="preserve">   </w:t>
+              <w:drawing>
+                <wp:inline>
+                  <wp:extent cx="1459075" cy="2926080"/>
+                  <wp:docPr id="320" name="Picture 320"/>
+                  <wp:cNvGraphicFramePr>
+                    <a:graphicFrameLocks noChangeAspect="1"/>
+                  </wp:cNvGraphicFramePr>
+                  <a:graphic>
+                    <a:graphicData uri="http://schemas.openxmlformats.org/drawingml/2006/picture">
+                      <pic:pic>
+                        <pic:nvPicPr>
+                          <pic:cNvPr id="0" name="2.jpeg"/>
+                          <pic:cNvPicPr/>
+                        </pic:nvPicPr>
+                        <pic:blipFill>
+                          <a:blip r:embed="rId27"/>
+                          <a:stretch>
+                            <a:fillRect/>
+                          </a:stretch>
+                        </pic:blipFill>
+                        <pic:spPr>
+                          <a:xfrm>
+                            <a:off x="0" y="0"/>
+                            <a:ext cx="1459075" cy="2926080"/>
+                          </a:xfrm>
+                          <a:prstGeom prst="rect"/>
+                        </pic:spPr>
+                      </pic:pic>
+                    </a:graphicData>
+                  </a:graphic>
+                </wp:inline>
+              </w:drawing>
+              <w:t xml:space="preserve">   </w:t>
+              <w:drawing>
+                <wp:inline>
+                  <wp:extent cx="1422173" cy="2926080"/>
+                  <wp:docPr id="321" name="Picture 321"/>
+                  <wp:cNvGraphicFramePr>
+                    <a:graphicFrameLocks noChangeAspect="1"/>
+                  </wp:cNvGraphicFramePr>
+                  <a:graphic>
+                    <a:graphicData uri="http://schemas.openxmlformats.org/drawingml/2006/picture">
+                      <pic:pic>
+                        <pic:nvPicPr>
+                          <pic:cNvPr id="0" name="3.jpeg"/>
+                          <pic:cNvPicPr/>
+                        </pic:nvPicPr>
+                        <pic:blipFill>
+                          <a:blip r:embed="rId28"/>
+                          <a:stretch>
+                            <a:fillRect/>
+                          </a:stretch>
+                        </pic:blipFill>
+                        <pic:spPr>
+                          <a:xfrm>
+                            <a:off x="0" y="0"/>
+                            <a:ext cx="1422173" cy="2926080"/>
+                          </a:xfrm>
+                          <a:prstGeom prst="rect"/>
+                        </pic:spPr>
+                      </pic:pic>
+                    </a:graphicData>
+                  </a:graphic>
+                </wp:inline>
+              </w:drawing>
             </w:r>
           </w:p>
         </w:tc>
@@ -8698,6 +9031,15 @@
               <w:rPr>
                 <w:rtl w:val="0"/>
               </w:rPr>
+            </w:r>
+            <w:r>
+              <w:rPr>
+                <w:rFonts w:ascii="Arial" w:hAnsi="Arial"/>
+                <w:b/>
+                <w:color w:val="2C5293"/>
+                <w:sz w:val="20"/>
+              </w:rPr>
+              <w:t xml:space="preserve"> - [Success]</w:t>
             </w:r>
           </w:p>
         </w:tc>
@@ -8837,14 +9179,75 @@
           <w:tcPr/>
           <w:p>
             <w:pPr>
-              <w:spacing w:before="116" w:lineRule="auto"/>
+              <w:spacing w:before="120" w:after="120"/>
               <w:jc w:val="center"/>
-              <w:rPr/>
-            </w:pPr>
-            <w:r>
-              <w:rPr>
-                <w:rtl w:val="0"/>
-              </w:rPr>
+            </w:pPr>
+            <w:r>
+              <w:drawing>
+                <wp:inline>
+                  <wp:extent cx="1732652" cy="3474720"/>
+                  <wp:docPr id="322" name="Picture 322"/>
+                  <wp:cNvGraphicFramePr>
+                    <a:graphicFrameLocks noChangeAspect="1"/>
+                  </wp:cNvGraphicFramePr>
+                  <a:graphic>
+                    <a:graphicData uri="http://schemas.openxmlformats.org/drawingml/2006/picture">
+                      <pic:pic>
+                        <pic:nvPicPr>
+                          <pic:cNvPr id="0" name="2.jpeg"/>
+                          <pic:cNvPicPr/>
+                        </pic:nvPicPr>
+                        <pic:blipFill>
+                          <a:blip r:embed="rId27"/>
+                          <a:stretch>
+                            <a:fillRect/>
+                          </a:stretch>
+                        </pic:blipFill>
+                        <pic:spPr>
+                          <a:xfrm>
+                            <a:off x="0" y="0"/>
+                            <a:ext cx="1732652" cy="3474720"/>
+                          </a:xfrm>
+                          <a:prstGeom prst="rect"/>
+                        </pic:spPr>
+                      </pic:pic>
+                    </a:graphicData>
+                  </a:graphic>
+                </wp:inline>
+              </w:drawing>
+              <w:t xml:space="preserve">   </w:t>
+              <w:drawing>
+                <wp:inline>
+                  <wp:extent cx="1728143" cy="3474720"/>
+                  <wp:docPr id="323" name="Picture 323"/>
+                  <wp:cNvGraphicFramePr>
+                    <a:graphicFrameLocks noChangeAspect="1"/>
+                  </wp:cNvGraphicFramePr>
+                  <a:graphic>
+                    <a:graphicData uri="http://schemas.openxmlformats.org/drawingml/2006/picture">
+                      <pic:pic>
+                        <pic:nvPicPr>
+                          <pic:cNvPr id="0" name="2.jpeg"/>
+                          <pic:cNvPicPr/>
+                        </pic:nvPicPr>
+                        <pic:blipFill>
+                          <a:blip r:embed="rId29"/>
+                          <a:stretch>
+                            <a:fillRect/>
+                          </a:stretch>
+                        </pic:blipFill>
+                        <pic:spPr>
+                          <a:xfrm>
+                            <a:off x="0" y="0"/>
+                            <a:ext cx="1728143" cy="3474720"/>
+                          </a:xfrm>
+                          <a:prstGeom prst="rect"/>
+                        </pic:spPr>
+                      </pic:pic>
+                    </a:graphicData>
+                  </a:graphic>
+                </wp:inline>
+              </w:drawing>
             </w:r>
           </w:p>
         </w:tc>
@@ -8921,6 +9324,15 @@
               <w:rPr>
                 <w:rtl w:val="0"/>
               </w:rPr>
+            </w:r>
+            <w:r>
+              <w:rPr>
+                <w:rFonts w:ascii="Arial" w:hAnsi="Arial"/>
+                <w:b/>
+                <w:color w:val="2C5293"/>
+                <w:sz w:val="20"/>
+              </w:rPr>
+              <w:t xml:space="preserve"> - [Success]</w:t>
             </w:r>
           </w:p>
         </w:tc>
@@ -15428,14 +15840,75 @@
           <w:tcPr/>
           <w:p>
             <w:pPr>
-              <w:spacing w:before="116" w:lineRule="auto"/>
+              <w:spacing w:before="120" w:after="120"/>
               <w:jc w:val="center"/>
-              <w:rPr/>
-            </w:pPr>
-            <w:r>
-              <w:rPr>
-                <w:rtl w:val="0"/>
-              </w:rPr>
+            </w:pPr>
+            <w:r>
+              <w:drawing>
+                <wp:inline>
+                  <wp:extent cx="1715852" cy="3474720"/>
+                  <wp:docPr id="324" name="Picture 324"/>
+                  <wp:cNvGraphicFramePr>
+                    <a:graphicFrameLocks noChangeAspect="1"/>
+                  </wp:cNvGraphicFramePr>
+                  <a:graphic>
+                    <a:graphicData uri="http://schemas.openxmlformats.org/drawingml/2006/picture">
+                      <pic:pic>
+                        <pic:nvPicPr>
+                          <pic:cNvPr id="0" name="1.jpeg"/>
+                          <pic:cNvPicPr/>
+                        </pic:nvPicPr>
+                        <pic:blipFill>
+                          <a:blip r:embed="rId30"/>
+                          <a:stretch>
+                            <a:fillRect/>
+                          </a:stretch>
+                        </pic:blipFill>
+                        <pic:spPr>
+                          <a:xfrm>
+                            <a:off x="0" y="0"/>
+                            <a:ext cx="1715852" cy="3474720"/>
+                          </a:xfrm>
+                          <a:prstGeom prst="rect"/>
+                        </pic:spPr>
+                      </pic:pic>
+                    </a:graphicData>
+                  </a:graphic>
+                </wp:inline>
+              </w:drawing>
+              <w:t xml:space="preserve">   </w:t>
+              <w:drawing>
+                <wp:inline>
+                  <wp:extent cx="1679768" cy="3474720"/>
+                  <wp:docPr id="325" name="Picture 325"/>
+                  <wp:cNvGraphicFramePr>
+                    <a:graphicFrameLocks noChangeAspect="1"/>
+                  </wp:cNvGraphicFramePr>
+                  <a:graphic>
+                    <a:graphicData uri="http://schemas.openxmlformats.org/drawingml/2006/picture">
+                      <pic:pic>
+                        <pic:nvPicPr>
+                          <pic:cNvPr id="0" name="2.jpeg"/>
+                          <pic:cNvPicPr/>
+                        </pic:nvPicPr>
+                        <pic:blipFill>
+                          <a:blip r:embed="rId31"/>
+                          <a:stretch>
+                            <a:fillRect/>
+                          </a:stretch>
+                        </pic:blipFill>
+                        <pic:spPr>
+                          <a:xfrm>
+                            <a:off x="0" y="0"/>
+                            <a:ext cx="1679768" cy="3474720"/>
+                          </a:xfrm>
+                          <a:prstGeom prst="rect"/>
+                        </pic:spPr>
+                      </pic:pic>
+                    </a:graphicData>
+                  </a:graphic>
+                </wp:inline>
+              </w:drawing>
             </w:r>
           </w:p>
         </w:tc>
@@ -15508,6 +15981,15 @@
               <w:rPr>
                 <w:rtl w:val="0"/>
               </w:rPr>
+            </w:r>
+            <w:r>
+              <w:rPr>
+                <w:rFonts w:ascii="Arial" w:hAnsi="Arial"/>
+                <w:b/>
+                <w:color w:val="2C5293"/>
+                <w:sz w:val="20"/>
+              </w:rPr>
+              <w:t xml:space="preserve"> - [Success]</w:t>
             </w:r>
           </w:p>
         </w:tc>
@@ -15647,14 +16129,42 @@
           <w:tcPr/>
           <w:p>
             <w:pPr>
-              <w:spacing w:before="116" w:lineRule="auto"/>
+              <w:spacing w:before="120" w:after="120"/>
               <w:jc w:val="center"/>
-              <w:rPr/>
-            </w:pPr>
-            <w:r>
-              <w:rPr>
-                <w:rtl w:val="0"/>
-              </w:rPr>
+            </w:pPr>
+            <w:r>
+              <w:drawing>
+                <wp:inline>
+                  <wp:extent cx="1792637" cy="3657600"/>
+                  <wp:docPr id="326" name="Picture 326"/>
+                  <wp:cNvGraphicFramePr>
+                    <a:graphicFrameLocks noChangeAspect="1"/>
+                  </wp:cNvGraphicFramePr>
+                  <a:graphic>
+                    <a:graphicData uri="http://schemas.openxmlformats.org/drawingml/2006/picture">
+                      <pic:pic>
+                        <pic:nvPicPr>
+                          <pic:cNvPr id="0" name="1.jpeg"/>
+                          <pic:cNvPicPr/>
+                        </pic:nvPicPr>
+                        <pic:blipFill>
+                          <a:blip r:embed="rId32"/>
+                          <a:stretch>
+                            <a:fillRect/>
+                          </a:stretch>
+                        </pic:blipFill>
+                        <pic:spPr>
+                          <a:xfrm>
+                            <a:off x="0" y="0"/>
+                            <a:ext cx="1792637" cy="3657600"/>
+                          </a:xfrm>
+                          <a:prstGeom prst="rect"/>
+                        </pic:spPr>
+                      </pic:pic>
+                    </a:graphicData>
+                  </a:graphic>
+                </wp:inline>
+              </w:drawing>
             </w:r>
           </w:p>
         </w:tc>
@@ -15731,6 +16241,15 @@
               <w:rPr>
                 <w:rtl w:val="0"/>
               </w:rPr>
+            </w:r>
+            <w:r>
+              <w:rPr>
+                <w:rFonts w:ascii="Arial" w:hAnsi="Arial"/>
+                <w:b/>
+                <w:color w:val="2C5293"/>
+                <w:sz w:val="20"/>
+              </w:rPr>
+              <w:t xml:space="preserve"> - [Success]</w:t>
             </w:r>
           </w:p>
         </w:tc>

</xml_diff>